<commit_message>
Leno: revisão Parte 4
Co-Authored-By: Claude Opus 5.5 <noreply@anthropic.com>
Claude-Session: https://claude.ai/code/session_01MJjUEEZrxQDEUifKK2vj9g
</commit_message>
<xml_diff>
--- a/roteiros/leno/Leno_Parte4.docx
+++ b/roteiros/leno/Leno_Parte4.docx
@@ -15,7 +15,7 @@
         <w:rPr>
           <w:color w:val="000000"/>
         </w:rPr>
-        <w:t>Para entender essa ferida, é preciso voltar para aquela sala que os dois dividiam dentro da CBS.</w:t>
+        <w:t>Para entender esse detalhe, é preciso voltar para aquela sala que os dois dividiam dentro da CBS.</w:t>
       </w:r>
     </w:p>
     <w:p>
@@ -55,7 +55,7 @@
         <w:rPr>
           <w:color w:val="000000"/>
         </w:rPr>
-        <w:t>Um dia, Leno comprou um jornalzinho alternativo, desses que circulavam por fora das grandes bancas. O nome era "2001". Dentro dele havia um artigo sobre ufologia, um assunto que fascinava os dois.</w:t>
+        <w:t>Um dia, Leno comprou um jornalzinho alternativo chamado "2001". Dentro dele havia um artigo sobre ufologia, um assunto que fascinava os dois.</w:t>
       </w:r>
     </w:p>
     <w:p>
@@ -95,7 +95,7 @@
         <w:rPr>
           <w:color w:val="C00000"/>
         </w:rPr>
-        <w:t>Pense no que esse encontro ia gerar. Porque, a partir dali, a dupla Raul Seixas e Paulo Coelho ia escrever algumas das músicas mais cantadas da história do Brasil. E quase ninguém sabe que tudo começou nas mãos de Leno.</w:t>
+        <w:t>Pense no que esse encontro ia gerar. Porque, a partir dali, a dupla Raul Seixas e Paulo Coelho ia escrever algumas das músicas mais famosas do rock brasileiro. E quase ninguém sabe que tudo começou nas mãos de Leno.</w:t>
       </w:r>
     </w:p>
     <w:p>
@@ -159,7 +159,7 @@
         <w:rPr>
           <w:color w:val="000000"/>
         </w:rPr>
-        <w:t>Raul, porém, nunca esqueceu.</w:t>
+        <w:t>Raul, porém, sabia.</w:t>
       </w:r>
     </w:p>
     <w:p>
@@ -183,7 +183,7 @@
         <w:rPr>
           <w:color w:val="000000"/>
         </w:rPr>
-        <w:t>Ali estavam Roberto Carlos, Erasmo Carlos, Caetano Veloso e outros nomes enormes da música brasileira.</w:t>
+        <w:t>Ali estavam nomes enormes da música brasileira, como Caetano Veloso e Gilberto Gil.</w:t>
       </w:r>
     </w:p>
     <w:p>
@@ -623,7 +623,7 @@
         <w:rPr>
           <w:color w:val="000000"/>
         </w:rPr>
-        <w:t>Primeiro, a ditadura cortou as letras dele. Depois, a gravadora escondeu o disco dele. E, quando o Brasil finalmente decidiu contar a história do amigo, cortaram Leno da própria história.</w:t>
+        <w:t>Em mil novecentos e setenta e um, a ditadura cortou as letras dele. Quando o Brasil finalmente decidiu contar a história do amigo, cortaram Leno da própria história.</w:t>
       </w:r>
     </w:p>
     <w:p>

</xml_diff>